<commit_message>
Full Sefer Elul 5785
</commit_message>
<xml_diff>
--- a/Files/06 - Yom Tov/08 - Elul/5785/Elul 5785.docx
+++ b/Files/06 - Yom Tov/08 - Elul/5785/Elul 5785.docx
@@ -52,7 +52,7 @@
           <w:rFonts w:ascii="Times New Roman" w:hAnsi="Times New Roman" w:cs="Times New Roman"/>
           <w:rtl/>
         </w:rPr>
-        <w:t>"</w:t>
+        <w:t>״</w:t>
       </w:r>
       <w:r>
         <w:rPr>
@@ -280,7 +280,7 @@
         <w:rPr>
           <w:rFonts w:ascii="Times New Roman" w:hAnsi="Times New Roman" w:cs="Times New Roman"/>
         </w:rPr>
-        <w:t xml:space="preserve"> a gate. So when the pasuk says</w:t>
+        <w:t xml:space="preserve"> a gate. So when the pasuk says </w:t>
       </w:r>
       <w:r>
         <w:rPr>

</xml_diff>